<commit_message>
Ročníková práce: odstraněn zastaralý placeholder u seznamu zdrojů
Co-Authored-By: Claude Sonnet 5.5 <noreply@anthropic.com>
</commit_message>
<xml_diff>
--- a/Dokumentace/Rocnikova_prace_Posledni_majak.docx
+++ b/Dokumentace/Rocnikova_prace_Posledni_majak.docx
@@ -10753,9 +10753,8 @@
       <w:r>
         <w:rPr>
           <w:rFonts w:ascii="Calibri" w:cs="Calibri" w:eastAsia="Calibri" w:hAnsi="Calibri"/>
-          <w:highlight w:val="yellow"/>
-        </w:rPr>
-        <w:t xml:space="preserve">[Zdroje jsou uvedeny podle ISO 690. U internetových zdrojů doplnit datum citace (poslední přístup) po ověření, že odkaz funguje.]</w:t>
+        </w:rPr>
+        <w:t xml:space="preserve">Zdroje jsou uvedeny podle ISO 690; u internetových zdrojů je uvedeno datum citace (poslední přístup), odkazy byly ověřeny 30. 9. 2026.</w:t>
       </w:r>
     </w:p>
     <w:p>

</xml_diff>